<commit_message>
Proposta paredes e lajes: metragem de paredes e de lajes em parágrafos separados
Co-Authored-By: Claude Opus 5.5 <noreply@anthropic.com>
Claude-Session: https://claude.ai/code/session_011SYqr4C9Af9MM6raxaY3fg
</commit_message>
<xml_diff>
--- a/public/modelos/proposta-paredes-lajes.docx
+++ b/public/modelos/proposta-paredes-lajes.docx
@@ -663,39 +663,25 @@
           <w:b/>
           <w:sz w:val="24"/>
         </w:rPr>
-        <w:t xml:space="preserve">Produção de </w:t>
-      </w:r>
-      <w:r>
-        <w:rPr>
-          <w:rFonts w:hint="default"/>
-          <w:b/>
-          <w:sz w:val="24"/>
-          <w:lang w:val="pt-BR"/>
-        </w:rPr>
-        <w:t xml:space="preserve">{{M2_PAREDES}} </w:t>
-      </w:r>
-      <w:r>
-        <w:rPr>
-          <w:b/>
-          <w:sz w:val="24"/>
-        </w:rPr>
-        <w:t>m² de Painéis de Paredes; Produção de</w:t>
-      </w:r>
-      <w:r>
-        <w:rPr>
-          <w:rFonts w:hint="default"/>
-          <w:b/>
-          <w:sz w:val="24"/>
-          <w:lang w:val="pt-BR"/>
-        </w:rPr>
-        <w:t xml:space="preserve"> {{M2_LAJES}}</w:t>
-      </w:r>
-      <w:r>
-        <w:rPr>
-          <w:b/>
-          <w:sz w:val="24"/>
-        </w:rPr>
-        <w:t xml:space="preserve"> m² Painéis de Lajes;</w:t>
+        <w:t>Produção de {{M2_PAREDES}} m² de Painéis de Paredes;</w:t>
+      </w:r>
+    </w:p>
+    <w:p>
+      <w:pPr>
+        <w:spacing w:before="0"/>
+        <w:ind w:left="568" w:right="4119" w:firstLine="0"/>
+        <w:jc w:val="left"/>
+        <w:rPr>
+          <w:b/>
+          <w:sz w:val="24"/>
+        </w:rPr>
+      </w:pPr>
+      <w:r>
+        <w:rPr>
+          <w:b/>
+          <w:sz w:val="24"/>
+        </w:rPr>
+        <w:t>Produção de {{M2_LAJES}} m² de Painéis de Lajes;</w:t>
       </w:r>
     </w:p>
     <w:p>

</xml_diff>